<commit_message>
Ordena la Fase 2 según el esqueleto del docente
- Nueva carpeta "Evidencias Proyecto (version Agil)" con los documentos
  01 (Product Vision), 02 (Product Backlog), 04 (Definition of Done),
  05 (Documento de Diseño basado en UML) y los videos de evidencia.
- El Documento de Diseño pasa a ser el Documento 05 y sigue la plantilla
  UML: casos de uso, vista lógica (E-R, clases, secuencia) y vista de
  despliegue (componentes y despliegue).
- El informe de avance actualiza las rutas de las evidencias.
</commit_message>
<xml_diff>
--- a/Fase 2/Evidencias Grupales/2.4_Informe_Avance_Fase2_SalaAbierta.docx
+++ b/Fase 2/Evidencias Grupales/2.4_Informe_Avance_Fase2_SalaAbierta.docx
@@ -1511,7 +1511,7 @@
                 <w:color w:val="1A1A1A"/>
                 <w:sz w:val="20"/>
               </w:rPr>
-              <w:t xml:space="preserve"> (repositorio, carpeta Fase 2/Evidencia Audiovisual): Evidencia_1 (1:20), apoderado en la versión web: inicio de sesión, anotaciones, muro con confirmación de recepción y comentarios. Evidencia_2 (1:04), puesta en marcha del backend y de la app. Evidencia_3 (2:17), profesor en un iPhone: error con credenciales incorrectas, asistencia masiva, registro y edición de notas con promedio, anotaciones y publicación en el muro.</w:t>
+              <w:t xml:space="preserve"> (repositorio, carpeta Fase 2/Evidencias Proyecto (version Agil)): Evidencia_1 (1:20), apoderado en la versión web: inicio de sesión, anotaciones, muro con confirmación de recepción y comentarios. Evidencia_2 (1:04), puesta en marcha del backend y de la app. Evidencia_3 (2:17), profesor en un iPhone: error con credenciales incorrectas, asistencia masiva, registro y edición de notas con promedio, anotaciones y publicación en el muro.</w:t>
             </w:r>
           </w:p>
           <w:p>
@@ -1573,17 +1573,17 @@
                 <w:color w:val="1A1A1A"/>
                 <w:sz w:val="20"/>
               </w:rPr>
-              <w:t>Documentos 01 a 04:</w:t>
-            </w:r>
-            <w:r>
-              <w:rPr>
-                <w:rFonts w:ascii="Calibri" w:hAnsi="Calibri"/>
-                <w:b w:val="0"/>
-                <w:i w:val="0"/>
-                <w:color w:val="1A1A1A"/>
-                <w:sz w:val="20"/>
-              </w:rPr>
-              <w:t xml:space="preserve"> Product Vision, Product Backlog, Documento de Diseño (arquitectura, modelo de datos, API, diagramas de secuencia y de casos de uso) y Definition of Done.</w:t>
+              <w:t>Documentos de la versión ágil</w:t>
+            </w:r>
+            <w:r>
+              <w:rPr>
+                <w:rFonts w:ascii="Calibri" w:hAnsi="Calibri"/>
+                <w:b w:val="0"/>
+                <w:i w:val="0"/>
+                <w:color w:val="1A1A1A"/>
+                <w:sz w:val="20"/>
+              </w:rPr>
+              <w:t xml:space="preserve"> (misma carpeta): 01 Product Vision, 02 Product Backlog, 04 Definition of Done y 05 Documento de Diseño basado en UML (casos de uso, modelo E-R, clases, secuencia, componentes y despliegue, además de arquitectura, seguridad, API y requisitos no funcionales).</w:t>
             </w:r>
           </w:p>
           <w:p>

</xml_diff>

<commit_message>
Agrega Sprint Backlog y presentación de la Fase 2
- Documento 03 - Sprint Backlog: sprints 1 a 10 con objetivo, historias,
  tareas, responsables, estado y evidencia de cada uno.
- Presentación de la Evaluación Sumativa 2 con notas del orador.
- Informe de avance: ambos integrantes como responsables de todas las
  actividades del plan de trabajo.
</commit_message>
<xml_diff>
--- a/Fase 2/Evidencias Grupales/2.4_Informe_Avance_Fase2_SalaAbierta.docx
+++ b/Fase 2/Evidencias Grupales/2.4_Informe_Avance_Fase2_SalaAbierta.docx
@@ -3818,7 +3818,7 @@
                 <w:color w:val="1A1A1A"/>
                 <w:sz w:val="15"/>
               </w:rPr>
-              <w:t>Catalina Aguilar</w:t>
+              <w:t>Fernando Pavez y Catalina Aguilar</w:t>
             </w:r>
           </w:p>
         </w:tc>
@@ -4038,7 +4038,7 @@
                 <w:color w:val="1A1A1A"/>
                 <w:sz w:val="15"/>
               </w:rPr>
-              <w:t>Catalina Aguilar</w:t>
+              <w:t>Fernando Pavez y Catalina Aguilar</w:t>
             </w:r>
           </w:p>
         </w:tc>
@@ -4258,7 +4258,7 @@
                 <w:color w:val="1A1A1A"/>
                 <w:sz w:val="15"/>
               </w:rPr>
-              <w:t>Catalina Aguilar</w:t>
+              <w:t>Fernando Pavez y Catalina Aguilar</w:t>
             </w:r>
           </w:p>
         </w:tc>
@@ -5526,17 +5526,17 @@
                 <w:color w:val="1A1A1A"/>
                 <w:sz w:val="20"/>
               </w:rPr>
-              <w:t>División clara de roles:</w:t>
-            </w:r>
-            <w:r>
-              <w:rPr>
-                <w:rFonts w:ascii="Calibri" w:hAnsi="Calibri"/>
-                <w:b w:val="0"/>
-                <w:i w:val="0"/>
-                <w:color w:val="1A1A1A"/>
-                <w:sz w:val="20"/>
-              </w:rPr>
-              <w:t xml:space="preserve"> Fernando en backend y datos, y Catalina en arquitectura y frontend móvil, lo que permitió avanzar en paralelo.</w:t>
+              <w:t>Trabajo conjunto en cada sprint con especialidades complementarias:</w:t>
+            </w:r>
+            <w:r>
+              <w:rPr>
+                <w:rFonts w:ascii="Calibri" w:hAnsi="Calibri"/>
+                <w:b w:val="0"/>
+                <w:i w:val="0"/>
+                <w:color w:val="1A1A1A"/>
+                <w:sz w:val="20"/>
+              </w:rPr>
+              <w:t xml:space="preserve"> ambos integrantes participaron en todas las historias; Fernando aporta su foco en backend y datos, y Catalina en arquitectura y frontend móvil, lo que facilitó la revisión cruzada.</w:t>
             </w:r>
           </w:p>
           <w:p>

</xml_diff>